<commit_message>
doc: correct scope in Markant audit (focus SBS as supplier)
</commit_message>
<xml_diff>
--- a/06_Markant_Mail_Audit_Andreas_Wiesner.docx
+++ b/06_Markant_Mail_Audit_Andreas_Wiesner.docx
@@ -83,7 +83,7 @@
           <w:rFonts w:ascii="Calibri" w:hAnsi="Calibri"/>
           <w:sz w:val="21"/>
         </w:rPr>
-        <w:t>Zur Information / Entscheidungsvorbereitung</w:t>
+        <w:t>Zur Information / Entscheidungsvorbereitung (Korrektur: Fokus SBS als Lieferant)</w:t>
         <w:br/>
       </w:r>
     </w:p>
@@ -135,7 +135,7 @@
           <w:i w:val="0"/>
           <w:sz w:val="22"/>
         </w:rPr>
-        <w:t>Wichtigste Erkenntnis für Elektro Pepi:</w:t>
+        <w:t>Wichtigste Klarstellung zur Rolle von SBS:</w:t>
       </w:r>
       <w:r>
         <w:rPr>
@@ -143,7 +143,7 @@
           <w:i w:val="0"/>
           <w:sz w:val="22"/>
         </w:rPr>
-        <w:t xml:space="preserve"> Der E-Mail-Text von Markant enthält gravierende rechtliche Diskrepanzen und stellt rein technische Krücken ihres PIM-Systems als gesetzliche Pflichten dar. Für Elektro Pepi besteht </w:t>
+        <w:t xml:space="preserve"> In dieser Konstellation ist </w:t>
       </w:r>
       <w:r>
         <w:rPr>
@@ -152,7 +152,7 @@
           <w:i w:val="0"/>
           <w:sz w:val="22"/>
         </w:rPr>
-        <w:t>kein technischer oder operativer Handlungsbedarf.</w:t>
+        <w:t>Globus Fachmärkte der Händler (Retailer)</w:t>
       </w:r>
       <w:r>
         <w:rPr>
@@ -160,7 +160,24 @@
           <w:i w:val="0"/>
           <w:sz w:val="22"/>
         </w:rPr>
-        <w:t xml:space="preserve"> Unser eingeschlagener Weg (direkte Excel-Erfassung der strukturierten Daten und dynamisches Rendering im Magento-Frontend) ist rechtssicher, schützt uns vor Abmahnungen und ist technisch deutlich robuster als das von Globus gewählte Verfahren.</w:t>
+        <w:t xml:space="preserve"> und </w:t>
+      </w:r>
+      <w:r>
+        <w:rPr>
+          <w:rFonts w:ascii="Calibri" w:hAnsi="Calibri"/>
+          <w:b/>
+          <w:i w:val="0"/>
+          <w:sz w:val="22"/>
+        </w:rPr>
+        <w:t>SBS Austria der Lieferant/Hersteller.</w:t>
+      </w:r>
+      <w:r>
+        <w:rPr>
+          <w:rFonts w:ascii="Calibri" w:hAnsi="Calibri"/>
+          <w:i w:val="0"/>
+          <w:sz w:val="22"/>
+        </w:rPr>
+        <w:t xml:space="preserve"> Die E-Mail fordert uns (SBS) auf, unsere Garantiedaten im Markant-PIM-System zu pflegen, damit Globus seine gesetzlichen Anzeigepflichten im Globus-Shop erfüllen kann. Die E-Mail von Markant enthält jedoch fachliche Ungenauigkeiten und verwechselt technische Anforderungen des Markant-Systems mit tatsächlichen gesetzlichen Verpflichtungen für uns als Lieferant.</w:t>
       </w:r>
     </w:p>
     <w:p>
@@ -202,7 +219,7 @@
         <w:t xml:space="preserve">Aussage Markant: </w:t>
       </w:r>
       <w:r>
-        <w:t>Lieferanten müssen ein „Garantie-Label als PDF“ über m.PIM hochladen, damit das System die gewerbliche Haltbarkeitsgarantie erkennt.</w:t>
+        <w:t>Lieferanten (SBS) müssen ein „Garantie-Label als PDF“ über m.PIM hochladen, damit das Globus-System die gewerbliche Haltbarkeitsgarantie erkennt.</w:t>
       </w:r>
     </w:p>
     <w:p>
@@ -217,7 +234,7 @@
         <w:t xml:space="preserve">Rechtlicher Fakt: </w:t>
       </w:r>
       <w:r>
-        <w:t>Es gibt keine gesetzliche Verpflichtung für Hersteller oder Händler, ein visuelles Label als PDF zu erstellen oder zu übermitteln. Die EU-Verordnung schreibt lediglich das Aussehen des grünen „GARAN“-Symbols (Jahre + Schriftzug) zwingend vor. Die Darstellung dieses Symbols erfolgt dynamisch durch die jeweilige Shop-Software des Händlers anhand der Rohdaten.</w:t>
+        <w:t>Es gibt keine gesetzliche Verpflichtung für Lieferanten oder Händler, ein visuelles Label als PDF zu erstellen oder hochzuladen. Das grüne „GARAN“-Symbol ist ein standardisiertes Element der EU-Kommission. Es wird von den Shop-Systemen der Händler (wie Globus) dynamisch gerendert.</w:t>
       </w:r>
     </w:p>
     <w:p>
@@ -229,10 +246,10 @@
         <w:rPr>
           <w:b/>
         </w:rPr>
-        <w:t xml:space="preserve">Hintergrund: </w:t>
+        <w:t xml:space="preserve">Bedeutung für SBS: </w:t>
       </w:r>
       <w:r>
-        <w:t>Das m.PIM-System von Markant kann die Garantiearten offenbar nicht intelligent filtern. Als Umgehungslösung prüft Globus einfach: „Liegt eine PDF-Datei vor? Wenn ja, blende das EU-Label ein.“ Das ist eine rein hausinterne IT-Spezialität von Globus/Markant und keine gesetzliche Pflicht.</w:t>
+        <w:t>Markant nutzt hier eine technische Krücke: Das Hochladen eines PDF-Dokuments (tatsächlich gemeint sind die Garantiebedingungen) dient im PIM-System lediglich als Auslöser (Trigger), um die Garantieart systemseitig zu filtern. SBS muss daher kein grafisches Label entwerfen, sondern lediglich die Garantiebedingungen (Text/PDF) hochladen.</w:t>
       </w:r>
     </w:p>
     <w:p>
@@ -261,7 +278,7 @@
         <w:t xml:space="preserve">Aussage Markant: </w:t>
       </w:r>
       <w:r>
-        <w:t>„Für die gewerbliche Haltbarkeitsgarantie ist der Händler darüber hinaus verpflichtet, diese Informationen [...] unter Verwendung des harmonisierten EU-Garantielabels darzustellen.“</w:t>
+        <w:t>„Für die gewerbliche Haltbarkeitsgarantie ist der Händler [Globus] darüber hinaus verpflichtet, diese Informationen [...] unter Verwendung des harmonisierten EU-Garantielabels darzustellen.“</w:t>
       </w:r>
     </w:p>
     <w:p>
@@ -276,7 +293,7 @@
         <w:t xml:space="preserve">Rechtlicher Fakt: </w:t>
       </w:r>
       <w:r>
-        <w:t>Die Pflicht des Händlers (Elektropepi oder Globus) ist laut EU-Richtlinie 2024/825 (EmpCo) und § 4 FAGG konditional (bedingt): Sie gilt nur dann, wenn der Hersteller dem Händler diese Informationen zur Verfügung stellt.</w:t>
+        <w:t>Die Anzeigepflicht des Händlers ist laut EU-Richtlinie 2024/825 (EmpCo) und FAGG konditional (bedingt). Sie gilt nur dann, wenn der Hersteller dem Händler diese Informationen zur Verfügung stellt.</w:t>
       </w:r>
     </w:p>
     <w:p>
@@ -288,10 +305,10 @@
         <w:rPr>
           <w:b/>
         </w:rPr>
-        <w:t xml:space="preserve">Hintergrund: </w:t>
+        <w:t xml:space="preserve">Bedeutung für SBS: </w:t>
       </w:r>
       <w:r>
-        <w:t>Liefert der Hersteller trotz Anfrage keine Daten, ist der Händler von der Anzeigepflicht des Labels befreit und kann für das Fehlen nicht abgemahnt werden. (Globus verschweigt diese gesetzliche Haftungsbefreiung im Anschreiben, um den Druck auf die Lieferanten zur Datenlieferung zu maximieren).</w:t>
+        <w:t>Globus/Markant stellen die Pflicht des Händlers als absolut dar, um Druck auf uns als Lieferanten auszuüben. Weigert sich ein Lieferant, Daten bereitzustellen, ist der Händler zwar von der Label-Anzeige befreit, darf aber auch nicht mehr mit der Garantie werben (Werbeverbot).</w:t>
       </w:r>
     </w:p>
     <w:p>
@@ -335,7 +352,7 @@
         <w:t xml:space="preserve">Rechtlicher Fakt: </w:t>
       </w:r>
       <w:r>
-        <w:t>Diese Logik birgt ein hohes rechtliches Risiko. Lädt ein Lieferant ein PDF für eine Teilgarantie hoch (z. B. eine 5-Jahres-Garantie, die nur den Kompressor eines Kühlschranks abdeckt), würde das System von Globus fälschlicherweise das EU-Garantielabel einblenden.</w:t>
+        <w:t>Das offizielle EU-Garantielabel darf ausschließlich für kostenlose Garantien verwendet werden, die das gesamte Gerät abdecken (gewerbliche Haltbarkeitsgarantie). Eine irrtümliche Einblendung des Labels bei Teilgarantien (z. B. nur auf den Motor) ist ein Wettbewerbsverstoß.</w:t>
       </w:r>
     </w:p>
     <w:p>
@@ -347,10 +364,10 @@
         <w:rPr>
           <w:b/>
         </w:rPr>
-        <w:t xml:space="preserve">Hintergrund: </w:t>
+        <w:t xml:space="preserve">Bedeutung für SBS: </w:t>
       </w:r>
       <w:r>
-        <w:t>Das offizielle EU-Garantielabel darf ausschließlich für Garantien verwendet werden, die kostenlos sind und das gesamte Gerät abdecken. Eine irrtümliche Einblendung des Labels bei Teilgarantien ist ein Wettbewerbsverstoß und führt zu einer direkten Abmahnbarkeit des Händlers.</w:t>
+        <w:t>Wenn SBS eine Teilgarantie anbietet und dafür fälschlicherweise ein PDF im m.PIM hochlädt, würde Globus dies automatisch als Vollgarantie labeln. Dies führt zu einer direkten Abmahnbarkeit des Händlers (Globus). Eine rein dateibasierte Erkennung durch das PIM-System ist fachlich und rechtlich riskant.</w:t>
       </w:r>
     </w:p>
     <w:p>
@@ -363,469 +380,38 @@
           <w:color w:val="1A365D"/>
           <w:sz w:val="26"/>
         </w:rPr>
-        <w:t>3. Vergleich der Vorgehensweisen: Globus/Markant vs. Elektro Pepi</w:t>
+        <w:t>3. Bewertung der Betroffenheit von SBS Austria</w:t>
       </w:r>
     </w:p>
-    <w:tbl>
-      <w:tblPr>
-        <w:tblStyle w:val="TableGrid"/>
-        <w:tblW w:type="auto" w:w="0"/>
-        <w:tblLook w:firstColumn="1" w:firstRow="1" w:lastColumn="0" w:lastRow="0" w:noHBand="0" w:noVBand="1" w:val="04A0"/>
-      </w:tblPr>
-      <w:tblGrid>
-        <w:gridCol w:w="3120"/>
-        <w:gridCol w:w="3120"/>
-        <w:gridCol w:w="3120"/>
-      </w:tblGrid>
-      <w:tr>
-        <w:tc>
-          <w:tcPr>
-            <w:tcW w:type="dxa" w:w="3120"/>
-            <w:shd w:val="clear" w:color="auto" w:fill="1A365D"/>
-            <w:tcMar>
-              <w:top w:w="80" w:type="dxa"/>
-              <w:bottom w:w="80" w:type="dxa"/>
-              <w:left w:w="120" w:type="dxa"/>
-              <w:right w:w="120" w:type="dxa"/>
-            </w:tcMar>
-          </w:tcPr>
-          <w:p>
-            <w:pPr>
-              <w:spacing w:before="60" w:after="60"/>
-            </w:pPr>
-            <w:r>
-              <w:rPr>
-                <w:rFonts w:ascii="Calibri" w:hAnsi="Calibri"/>
-                <w:b/>
-                <w:color w:val="FFFFFF"/>
-                <w:sz w:val="19"/>
-              </w:rPr>
-              <w:t>Kriterium</w:t>
-            </w:r>
-          </w:p>
-        </w:tc>
-        <w:tc>
-          <w:tcPr>
-            <w:tcW w:type="dxa" w:w="3120"/>
-            <w:shd w:val="clear" w:color="auto" w:fill="1A365D"/>
-            <w:tcMar>
-              <w:top w:w="80" w:type="dxa"/>
-              <w:bottom w:w="80" w:type="dxa"/>
-              <w:left w:w="120" w:type="dxa"/>
-              <w:right w:w="120" w:type="dxa"/>
-            </w:tcMar>
-          </w:tcPr>
-          <w:p>
-            <w:pPr>
-              <w:spacing w:before="60" w:after="60"/>
-            </w:pPr>
-            <w:r>
-              <w:rPr>
-                <w:rFonts w:ascii="Calibri" w:hAnsi="Calibri"/>
-                <w:b/>
-                <w:color w:val="FFFFFF"/>
-                <w:sz w:val="19"/>
-              </w:rPr>
-              <w:t>Ansatz Globus Fachmärkte (Markant)</w:t>
-            </w:r>
-          </w:p>
-        </w:tc>
-        <w:tc>
-          <w:tcPr>
-            <w:tcW w:type="dxa" w:w="3120"/>
-            <w:shd w:val="clear" w:color="auto" w:fill="1A365D"/>
-            <w:tcMar>
-              <w:top w:w="80" w:type="dxa"/>
-              <w:bottom w:w="80" w:type="dxa"/>
-              <w:left w:w="120" w:type="dxa"/>
-              <w:right w:w="120" w:type="dxa"/>
-            </w:tcMar>
-          </w:tcPr>
-          <w:p>
-            <w:pPr>
-              <w:spacing w:before="60" w:after="60"/>
-            </w:pPr>
-            <w:r>
-              <w:rPr>
-                <w:rFonts w:ascii="Calibri" w:hAnsi="Calibri"/>
-                <w:b/>
-                <w:color w:val="FFFFFF"/>
-                <w:sz w:val="19"/>
-              </w:rPr>
-              <w:t>Ansatz Elektro Pepi (Magento 2)</w:t>
-            </w:r>
-          </w:p>
-        </w:tc>
-      </w:tr>
-      <w:tr>
-        <w:tc>
-          <w:tcPr>
-            <w:tcW w:type="dxa" w:w="3120"/>
-            <w:shd w:val="clear" w:color="auto" w:fill="F2F4F8"/>
-            <w:tcMar>
-              <w:top w:w="80" w:type="dxa"/>
-              <w:bottom w:w="80" w:type="dxa"/>
-              <w:left w:w="120" w:type="dxa"/>
-              <w:right w:w="120" w:type="dxa"/>
-            </w:tcMar>
-          </w:tcPr>
-          <w:p>
-            <w:pPr>
-              <w:spacing w:before="60" w:after="60"/>
-            </w:pPr>
-            <w:r>
-              <w:rPr>
-                <w:rFonts w:ascii="Calibri" w:hAnsi="Calibri"/>
-                <w:sz w:val="19"/>
-              </w:rPr>
-              <w:t>Datenquelle</w:t>
-            </w:r>
-          </w:p>
-        </w:tc>
-        <w:tc>
-          <w:tcPr>
-            <w:tcW w:type="dxa" w:w="3120"/>
-            <w:shd w:val="clear" w:color="auto" w:fill="F2F4F8"/>
-            <w:tcMar>
-              <w:top w:w="80" w:type="dxa"/>
-              <w:bottom w:w="80" w:type="dxa"/>
-              <w:left w:w="120" w:type="dxa"/>
-              <w:right w:w="120" w:type="dxa"/>
-            </w:tcMar>
-          </w:tcPr>
-          <w:p>
-            <w:pPr>
-              <w:spacing w:before="60" w:after="60"/>
-            </w:pPr>
-            <w:r>
-              <w:rPr>
-                <w:rFonts w:ascii="Calibri" w:hAnsi="Calibri"/>
-                <w:sz w:val="19"/>
-              </w:rPr>
-              <w:t>m.PIM / GDSN-Netzwerk (Standardisierte PIM-Felder)</w:t>
-            </w:r>
-          </w:p>
-        </w:tc>
-        <w:tc>
-          <w:tcPr>
-            <w:tcW w:type="dxa" w:w="3120"/>
-            <w:shd w:val="clear" w:color="auto" w:fill="F2F4F8"/>
-            <w:tcMar>
-              <w:top w:w="80" w:type="dxa"/>
-              <w:bottom w:w="80" w:type="dxa"/>
-              <w:left w:w="120" w:type="dxa"/>
-              <w:right w:w="120" w:type="dxa"/>
-            </w:tcMar>
-          </w:tcPr>
-          <w:p>
-            <w:pPr>
-              <w:spacing w:before="60" w:after="60"/>
-            </w:pPr>
-            <w:r>
-              <w:rPr>
-                <w:rFonts w:ascii="Calibri" w:hAnsi="Calibri"/>
-                <w:sz w:val="19"/>
-              </w:rPr>
-              <w:t>Direkte, strukturierte Lieferanten-Excelabfrage (DE/EN)</w:t>
-            </w:r>
-          </w:p>
-        </w:tc>
-      </w:tr>
-      <w:tr>
-        <w:tc>
-          <w:tcPr>
-            <w:tcW w:type="dxa" w:w="3120"/>
-            <w:tcMar>
-              <w:top w:w="80" w:type="dxa"/>
-              <w:bottom w:w="80" w:type="dxa"/>
-              <w:left w:w="120" w:type="dxa"/>
-              <w:right w:w="120" w:type="dxa"/>
-            </w:tcMar>
-          </w:tcPr>
-          <w:p>
-            <w:pPr>
-              <w:spacing w:before="60" w:after="60"/>
-            </w:pPr>
-            <w:r>
-              <w:rPr>
-                <w:rFonts w:ascii="Calibri" w:hAnsi="Calibri"/>
-                <w:sz w:val="19"/>
-              </w:rPr>
-              <w:t>Garantie-Nachweis</w:t>
-            </w:r>
-          </w:p>
-        </w:tc>
-        <w:tc>
-          <w:tcPr>
-            <w:tcW w:type="dxa" w:w="3120"/>
-            <w:tcMar>
-              <w:top w:w="80" w:type="dxa"/>
-              <w:bottom w:w="80" w:type="dxa"/>
-              <w:left w:w="120" w:type="dxa"/>
-              <w:right w:w="120" w:type="dxa"/>
-            </w:tcMar>
-          </w:tcPr>
-          <w:p>
-            <w:pPr>
-              <w:spacing w:before="60" w:after="60"/>
-            </w:pPr>
-            <w:r>
-              <w:rPr>
-                <w:rFonts w:ascii="Calibri" w:hAnsi="Calibri"/>
-                <w:sz w:val="19"/>
-              </w:rPr>
-              <w:t>Manueller PDF-Upload durch Lieferanten</w:t>
-            </w:r>
-          </w:p>
-        </w:tc>
-        <w:tc>
-          <w:tcPr>
-            <w:tcW w:type="dxa" w:w="3120"/>
-            <w:tcMar>
-              <w:top w:w="80" w:type="dxa"/>
-              <w:bottom w:w="80" w:type="dxa"/>
-              <w:left w:w="120" w:type="dxa"/>
-              <w:right w:w="120" w:type="dxa"/>
-            </w:tcMar>
-          </w:tcPr>
-          <w:p>
-            <w:pPr>
-              <w:spacing w:before="60" w:after="60"/>
-            </w:pPr>
-            <w:r>
-              <w:rPr>
-                <w:rFonts w:ascii="Calibri" w:hAnsi="Calibri"/>
-                <w:sz w:val="19"/>
-              </w:rPr>
-              <w:t>Strukturierte Angaben (Marke, Modell, Jahre, URL, Vollgarantie-Ja/Nein)</w:t>
-            </w:r>
-          </w:p>
-        </w:tc>
-      </w:tr>
-      <w:tr>
-        <w:tc>
-          <w:tcPr>
-            <w:tcW w:type="dxa" w:w="3120"/>
-            <w:shd w:val="clear" w:color="auto" w:fill="F2F4F8"/>
-            <w:tcMar>
-              <w:top w:w="80" w:type="dxa"/>
-              <w:bottom w:w="80" w:type="dxa"/>
-              <w:left w:w="120" w:type="dxa"/>
-              <w:right w:w="120" w:type="dxa"/>
-            </w:tcMar>
-          </w:tcPr>
-          <w:p>
-            <w:pPr>
-              <w:spacing w:before="60" w:after="60"/>
-            </w:pPr>
-            <w:r>
-              <w:rPr>
-                <w:rFonts w:ascii="Calibri" w:hAnsi="Calibri"/>
-                <w:sz w:val="19"/>
-              </w:rPr>
-              <w:t>Label-Erstellung</w:t>
-            </w:r>
-          </w:p>
-        </w:tc>
-        <w:tc>
-          <w:tcPr>
-            <w:tcW w:type="dxa" w:w="3120"/>
-            <w:shd w:val="clear" w:color="auto" w:fill="F2F4F8"/>
-            <w:tcMar>
-              <w:top w:w="80" w:type="dxa"/>
-              <w:bottom w:w="80" w:type="dxa"/>
-              <w:left w:w="120" w:type="dxa"/>
-              <w:right w:w="120" w:type="dxa"/>
-            </w:tcMar>
-          </w:tcPr>
-          <w:p>
-            <w:pPr>
-              <w:spacing w:before="60" w:after="60"/>
-            </w:pPr>
-            <w:r>
-              <w:rPr>
-                <w:rFonts w:ascii="Calibri" w:hAnsi="Calibri"/>
-                <w:sz w:val="19"/>
-              </w:rPr>
-              <w:t>Abhängig von hochgeladener PDF-Datei</w:t>
-            </w:r>
-          </w:p>
-        </w:tc>
-        <w:tc>
-          <w:tcPr>
-            <w:tcW w:type="dxa" w:w="3120"/>
-            <w:shd w:val="clear" w:color="auto" w:fill="F2F4F8"/>
-            <w:tcMar>
-              <w:top w:w="80" w:type="dxa"/>
-              <w:bottom w:w="80" w:type="dxa"/>
-              <w:left w:w="120" w:type="dxa"/>
-              <w:right w:w="120" w:type="dxa"/>
-            </w:tcMar>
-          </w:tcPr>
-          <w:p>
-            <w:pPr>
-              <w:spacing w:before="60" w:after="60"/>
-            </w:pPr>
-            <w:r>
-              <w:rPr>
-                <w:rFonts w:ascii="Calibri" w:hAnsi="Calibri"/>
-                <w:sz w:val="19"/>
-              </w:rPr>
-              <w:t>Vollautomatische, dynamische HTML/CSS-Generierung im Frontend</w:t>
-            </w:r>
-          </w:p>
-        </w:tc>
-      </w:tr>
-      <w:tr>
-        <w:tc>
-          <w:tcPr>
-            <w:tcW w:type="dxa" w:w="3120"/>
-            <w:tcMar>
-              <w:top w:w="80" w:type="dxa"/>
-              <w:bottom w:w="80" w:type="dxa"/>
-              <w:left w:w="120" w:type="dxa"/>
-              <w:right w:w="120" w:type="dxa"/>
-            </w:tcMar>
-          </w:tcPr>
-          <w:p>
-            <w:pPr>
-              <w:spacing w:before="60" w:after="60"/>
-            </w:pPr>
-            <w:r>
-              <w:rPr>
-                <w:rFonts w:ascii="Calibri" w:hAnsi="Calibri"/>
-                <w:sz w:val="19"/>
-              </w:rPr>
-              <w:t>Fehlerrisiko</w:t>
-            </w:r>
-          </w:p>
-        </w:tc>
-        <w:tc>
-          <w:tcPr>
-            <w:tcW w:type="dxa" w:w="3120"/>
-            <w:tcMar>
-              <w:top w:w="80" w:type="dxa"/>
-              <w:bottom w:w="80" w:type="dxa"/>
-              <w:left w:w="120" w:type="dxa"/>
-              <w:right w:w="120" w:type="dxa"/>
-            </w:tcMar>
-          </w:tcPr>
-          <w:p>
-            <w:pPr>
-              <w:spacing w:before="60" w:after="60"/>
-            </w:pPr>
-            <w:r>
-              <w:rPr>
-                <w:rFonts w:ascii="Calibri" w:hAnsi="Calibri"/>
-                <w:sz w:val="19"/>
-              </w:rPr>
-              <w:t>Hoch (Upload falscher PDFs führt zu unzulässiger Label-Anzeige)</w:t>
-            </w:r>
-          </w:p>
-        </w:tc>
-        <w:tc>
-          <w:tcPr>
-            <w:tcW w:type="dxa" w:w="3120"/>
-            <w:tcMar>
-              <w:top w:w="80" w:type="dxa"/>
-              <w:bottom w:w="80" w:type="dxa"/>
-              <w:left w:w="120" w:type="dxa"/>
-              <w:right w:w="120" w:type="dxa"/>
-            </w:tcMar>
-          </w:tcPr>
-          <w:p>
-            <w:pPr>
-              <w:spacing w:before="60" w:after="60"/>
-            </w:pPr>
-            <w:r>
-              <w:rPr>
-                <w:rFonts w:ascii="Calibri" w:hAnsi="Calibri"/>
-                <w:sz w:val="19"/>
-              </w:rPr>
-              <w:t>Minimiert (Filterung über dedizierte Spalte I verhindert Fehlbelegungen)</w:t>
-            </w:r>
-          </w:p>
-        </w:tc>
-      </w:tr>
-      <w:tr>
-        <w:tc>
-          <w:tcPr>
-            <w:tcW w:type="dxa" w:w="3120"/>
-            <w:shd w:val="clear" w:color="auto" w:fill="F2F4F8"/>
-            <w:tcMar>
-              <w:top w:w="80" w:type="dxa"/>
-              <w:bottom w:w="80" w:type="dxa"/>
-              <w:left w:w="120" w:type="dxa"/>
-              <w:right w:w="120" w:type="dxa"/>
-            </w:tcMar>
-          </w:tcPr>
-          <w:p>
-            <w:pPr>
-              <w:spacing w:before="60" w:after="60"/>
-            </w:pPr>
-            <w:r>
-              <w:rPr>
-                <w:rFonts w:ascii="Calibri" w:hAnsi="Calibri"/>
-                <w:sz w:val="19"/>
-              </w:rPr>
-              <w:t>Abmahnschutz</w:t>
-            </w:r>
-          </w:p>
-        </w:tc>
-        <w:tc>
-          <w:tcPr>
-            <w:tcW w:type="dxa" w:w="3120"/>
-            <w:shd w:val="clear" w:color="auto" w:fill="F2F4F8"/>
-            <w:tcMar>
-              <w:top w:w="80" w:type="dxa"/>
-              <w:bottom w:w="80" w:type="dxa"/>
-              <w:left w:w="120" w:type="dxa"/>
-              <w:right w:w="120" w:type="dxa"/>
-            </w:tcMar>
-          </w:tcPr>
-          <w:p>
-            <w:pPr>
-              <w:spacing w:before="60" w:after="60"/>
-            </w:pPr>
-            <w:r>
-              <w:rPr>
-                <w:rFonts w:ascii="Calibri" w:hAnsi="Calibri"/>
-                <w:sz w:val="19"/>
-              </w:rPr>
-              <w:t>Schwach, da Systemlogik fehleranfällig ist</w:t>
-            </w:r>
-          </w:p>
-        </w:tc>
-        <w:tc>
-          <w:tcPr>
-            <w:tcW w:type="dxa" w:w="3120"/>
-            <w:shd w:val="clear" w:color="auto" w:fill="F2F4F8"/>
-            <w:tcMar>
-              <w:top w:w="80" w:type="dxa"/>
-              <w:bottom w:w="80" w:type="dxa"/>
-              <w:left w:w="120" w:type="dxa"/>
-              <w:right w:w="120" w:type="dxa"/>
-            </w:tcMar>
-          </w:tcPr>
-          <w:p>
-            <w:pPr>
-              <w:spacing w:before="60" w:after="60"/>
-            </w:pPr>
-            <w:r>
-              <w:rPr>
-                <w:rFonts w:ascii="Calibri" w:hAnsi="Calibri"/>
-                <w:sz w:val="19"/>
-              </w:rPr>
-              <w:t>Stark, da bei Verweigerung kein Label angezeigt wird (Werbung wird blockiert)</w:t>
-            </w:r>
-          </w:p>
-        </w:tc>
-      </w:tr>
-    </w:tbl>
     <w:p>
       <w:pPr>
-        <w:spacing w:before="240" w:after="120"/>
+        <w:pStyle w:val="ListBullet"/>
+        <w:spacing w:after="60"/>
       </w:pPr>
+      <w:r>
+        <w:rPr>
+          <w:b/>
+        </w:rPr>
+        <w:t xml:space="preserve">Prüfung des Sortiments (Betroffenheit): </w:t>
+      </w:r>
+      <w:r>
+        <w:t>Bietet SBS Austria für Artikel, die an Globus geliefert werden, eine kostenlose Herstellergarantie von mehr als 2 Jahren an, die das gesamte Produkt abdeckt? Falls ja, sind wir verpflichtet, die Garantiedauer in m.PIM einzutragen und die Garantiebedingungen als PDF hochzuladen. Falls nein, ist keine Aktion erforderlich.</w:t>
+      </w:r>
+    </w:p>
+    <w:p>
+      <w:pPr>
+        <w:pStyle w:val="ListBullet"/>
+        <w:spacing w:after="240"/>
+      </w:pPr>
+      <w:r>
+        <w:rPr>
+          <w:b/>
+        </w:rPr>
+        <w:t xml:space="preserve">Keine grafischen Arbeiten nötig: </w:t>
+      </w:r>
+      <w:r>
+        <w:t>Der Einkauf bzw. Produktmanagement von SBS muss keine Bilddateien oder Logos entwerfen. Das geforderte Dokument ist lediglich das Text-PDF der Garantievereinbarung.</w:t>
+      </w:r>
     </w:p>
     <w:p>
       <w:pPr>
@@ -842,15 +428,17 @@
     </w:p>
     <w:p>
       <w:pPr>
-        <w:spacing w:after="120" w:before="0"/>
+        <w:pStyle w:val="ListNumber"/>
+        <w:spacing w:after="60"/>
       </w:pPr>
       <w:r>
         <w:rPr>
-          <w:rFonts w:ascii="Calibri" w:hAnsi="Calibri"/>
-          <w:i w:val="0"/>
-          <w:sz w:val="22"/>
+          <w:b/>
         </w:rPr>
-        <w:t>Da unser technisches und organisatorisches Konzept vollkommen konform mit der Rechtslage und dem WKO-Seminar ist, sind keine Änderungen an den Excel-Dateien oder am Magento-Modul nötig.</w:t>
+        <w:t xml:space="preserve">Schritt 1: Sortimentsabgleich durch Produktmanagement / Vertrieb: </w:t>
+      </w:r>
+      <w:r>
+        <w:t>Prüfen, ob SBS-Eigenmarken oder exklusiv vertriebene Artikel mit einer kostenlosen Herstellergarantie von &gt; 2 Jahren an Globus geliefert werden.</w:t>
       </w:r>
     </w:p>
     <w:p>
@@ -862,10 +450,10 @@
         <w:rPr>
           <w:b/>
         </w:rPr>
-        <w:t xml:space="preserve">Konsequente Nutzung unserer Excel-Abfragen: </w:t>
+        <w:t xml:space="preserve">Schritt 2: Datenpflege im m.PIM (nur bei Betroffenheit): </w:t>
       </w:r>
       <w:r>
-        <w:t>Lieferanten müssen unsere Tabellen ausfüllen. Verweisen Lieferanten darauf, die Daten bei Markant eingepflegt zu haben, sollte der Einkauf klarstellen, dass Elektro Pepi keinen automatisierten Import aus dem GDSN-Pool nutzt und die Daten zwingend strukturiert über unsere Dateien benötigt.</w:t>
+        <w:t>Aktivierung der „Globus Fachmärkte“-Extension im m.PIM und Befüllung des Attributs „Herstellergarantie“ (in Monaten) sowie Upload der Garantiebedingungen (PDF) für die betroffenen Artikel vor Ablauf der Frist am 27.07.2026.</w:t>
       </w:r>
     </w:p>
     <w:p>
@@ -877,10 +465,10 @@
         <w:rPr>
           <w:b/>
         </w:rPr>
-        <w:t xml:space="preserve">Nutzung des Hebel-Arguments: </w:t>
+        <w:t xml:space="preserve">Schritt 3: Rückmeldung bei Nicht-Betroffenheit: </w:t>
       </w:r>
       <w:r>
-        <w:t>Verweigerung führt direkt dazu, dass wir mit dieser Garantie im Shop nicht mehr werben dürfen. Das schadet dem Umsatz des Lieferanten und ist das stärkste Argument des Einkaufs bei Verweigerern.</w:t>
+        <w:t>Ergibt die Prüfung, dass SBS für Globus-Artikel keine Garantien über 2 Jahre gewährt, sollte dem Globus-Einkauf kurz schriftlich bestätigt werden, dass unsere Artikel nicht unter die Richtlinie fallen.</w:t>
       </w:r>
     </w:p>
     <w:sectPr>

</xml_diff>

<commit_message>
doc: refine Markant audit to clearly separate duties and non-duties for SBS
</commit_message>
<xml_diff>
--- a/06_Markant_Mail_Audit_Andreas_Wiesner.docx
+++ b/06_Markant_Mail_Audit_Andreas_Wiesner.docx
@@ -135,7 +135,7 @@
           <w:i w:val="0"/>
           <w:sz w:val="22"/>
         </w:rPr>
-        <w:t>Wichtigste Klarstellung zur Rolle von SBS:</w:t>
+        <w:t>Richtigstellung der Rollen:</w:t>
       </w:r>
       <w:r>
         <w:rPr>
@@ -177,7 +177,7 @@
           <w:i w:val="0"/>
           <w:sz w:val="22"/>
         </w:rPr>
-        <w:t xml:space="preserve"> Die E-Mail fordert uns (SBS) auf, unsere Garantiedaten im Markant-PIM-System zu pflegen, damit Globus seine gesetzlichen Anzeigepflichten im Globus-Shop erfüllen kann. Die E-Mail von Markant enthält jedoch fachliche Ungenauigkeiten und verwechselt technische Anforderungen des Markant-Systems mit tatsächlichen gesetzlichen Verpflichtungen für uns als Lieferant.</w:t>
+        <w:t xml:space="preserve"> Globus verlangt von uns (SBS) Garantiedaten, um seine gesetzlichen Verbraucherinformationspflichten erfüllen zu können. Die E-Mail von Markant enthält jedoch fachliche Ungenauigkeiten und verwechselt technische Anforderungen des Markant-Systems mit tatsächlichen gesetzlichen Verpflichtungen für uns als Lieferant.</w:t>
       </w:r>
     </w:p>
     <w:p>
@@ -234,7 +234,7 @@
         <w:t xml:space="preserve">Rechtlicher Fakt: </w:t>
       </w:r>
       <w:r>
-        <w:t>Es gibt keine gesetzliche Verpflichtung für Lieferanten oder Händler, ein visuelles Label als PDF zu erstellen oder hochzuladen. Das grüne „GARAN“-Symbol ist ein standardisiertes Element der EU-Kommission. Es wird von den Shop-Systemen der Händler (wie Globus) dynamisch gerendert.</w:t>
+        <w:t>Es gibt keine gesetzliche Verpflichtung für uns als Lieferant, ein visuelles Label als PDF zu erstellen oder hochzuladen. Das grüne „GARAN“-Symbol ist ein standardisiertes Element der EU-Kommission. Es wird von den Shop-Systemen der Händler (wie Globus) dynamisch gerendert.</w:t>
       </w:r>
     </w:p>
     <w:p>
@@ -380,37 +380,153 @@
           <w:color w:val="1A365D"/>
           <w:sz w:val="26"/>
         </w:rPr>
-        <w:t>3. Bewertung der Betroffenheit von SBS Austria</w:t>
+        <w:t>3. Klarstellung der Pflichten für SBS Austria</w:t>
       </w:r>
     </w:p>
     <w:p>
       <w:pPr>
-        <w:pStyle w:val="ListBullet"/>
+        <w:spacing w:after="120" w:before="0"/>
+      </w:pPr>
+      <w:r>
+        <w:rPr>
+          <w:rFonts w:ascii="Calibri" w:hAnsi="Calibri"/>
+          <w:i w:val="0"/>
+          <w:sz w:val="22"/>
+        </w:rPr>
+        <w:t>Um für die Geschäftsführung absolute Klarheit zu schaffen, werden unsere Pflichten im Folgenden in „tatsächliche Pflichten“ und „keine Verpflichtungen“ unterteilt:</w:t>
+      </w:r>
+    </w:p>
+    <w:p>
+      <w:pPr>
+        <w:spacing w:after="60" w:before="80"/>
+      </w:pPr>
+      <w:r>
+        <w:rPr>
+          <w:rFonts w:ascii="Calibri" w:hAnsi="Calibri"/>
+          <w:b/>
+          <w:i w:val="0"/>
+          <w:sz w:val="23"/>
+        </w:rPr>
+        <w:t>A. Wozu SBS tatsächlich verpflichtet ist (Tatsächliche Pflichten)</w:t>
+      </w:r>
+    </w:p>
+    <w:p>
+      <w:pPr>
+        <w:pStyle w:val="ListNumber"/>
         <w:spacing w:after="60"/>
       </w:pPr>
       <w:r>
         <w:rPr>
           <w:b/>
         </w:rPr>
-        <w:t xml:space="preserve">Prüfung des Sortiments (Betroffenheit): </w:t>
+        <w:t xml:space="preserve">Bereitstellung von Garantiedaten bei aktiver Werbung (Kommerzieller Zwang): </w:t>
       </w:r>
       <w:r>
-        <w:t>Bietet SBS Austria für Artikel, die an Globus geliefert werden, eine kostenlose Herstellergarantie von mehr als 2 Jahren an, die das gesamte Produkt abdeckt? Falls ja, sind wir verpflichtet, die Garantiedauer in m.PIM einzutragen und die Garantiebedingungen als PDF hochzuladen. Falls nein, ist keine Aktion erforderlich.</w:t>
+        <w:t>Wenn SBS möchte, dass Globus unsere Artikel mit einer Herstellergarantie von über 2 Jahren bewirbt, müssen wir die Daten (Dauer und Link zu den Bedingungen) liefern. Ohne diese Daten darf Globus die Garantie im Shop nicht mehr erwähnen.</w:t>
       </w:r>
     </w:p>
     <w:p>
       <w:pPr>
-        <w:pStyle w:val="ListBullet"/>
+        <w:pStyle w:val="ListNumber"/>
+        <w:spacing w:after="60"/>
+      </w:pPr>
+      <w:r>
+        <w:rPr>
+          <w:b/>
+        </w:rPr>
+        <w:t xml:space="preserve">Datenpflege im PIM-System (Schnittstellen-Vertrag): </w:t>
+      </w:r>
+      <w:r>
+        <w:t>Um im m.PIM/GDSN-System von Globus gelistet zu bleiben, müssen wir die entsprechenden Datenfelder (Garantiedauer in Monaten) befüllen.</w:t>
+      </w:r>
+    </w:p>
+    <w:p>
+      <w:pPr>
+        <w:pStyle w:val="ListNumber"/>
+        <w:spacing w:after="120"/>
+      </w:pPr>
+      <w:r>
+        <w:rPr>
+          <w:b/>
+        </w:rPr>
+        <w:t xml:space="preserve">Haftung für die Richtigkeit der Angaben: </w:t>
+      </w:r>
+      <w:r>
+        <w:t>SBS haftet gegenüber Globus für die Richtigkeit der übermittelten Daten. Bestätigen wir fälschlicherweise eine Garantie als „kostenlose Vollgarantie“ (obwohl es sich um eine Teilgarantie handelt) und wird Globus deswegen abgemahnt, drohen SBS Regressforderungen.</w:t>
+      </w:r>
+    </w:p>
+    <w:p>
+      <w:pPr>
+        <w:spacing w:after="60" w:before="80"/>
+      </w:pPr>
+      <w:r>
+        <w:rPr>
+          <w:rFonts w:ascii="Calibri" w:hAnsi="Calibri"/>
+          <w:b/>
+          <w:i w:val="0"/>
+          <w:sz w:val="23"/>
+        </w:rPr>
+        <w:t>B. Wozu SBS NICHT verpflichtet ist (Keine Verpflichtungen)</w:t>
+      </w:r>
+    </w:p>
+    <w:p>
+      <w:pPr>
+        <w:pStyle w:val="ListNumber"/>
+        <w:spacing w:after="60"/>
+      </w:pPr>
+      <w:r>
+        <w:rPr>
+          <w:b/>
+        </w:rPr>
+        <w:t xml:space="preserve">Kein Erstellen oder Liefern von Grafik-Labels (Bilddateien): </w:t>
+      </w:r>
+      <w:r>
+        <w:t>SBS muss keine Bilddateien, PNGs oder fertig gestalteten grünen Symbole („3 GARAN“ etc.) an Globus liefern. Das Rendern des Labels ist die alleinige technische Aufgabe des Online-Shops von Globus.</w:t>
+      </w:r>
+    </w:p>
+    <w:p>
+      <w:pPr>
+        <w:pStyle w:val="ListNumber"/>
+        <w:spacing w:after="60"/>
+      </w:pPr>
+      <w:r>
+        <w:rPr>
+          <w:b/>
+        </w:rPr>
+        <w:t xml:space="preserve">Keine Label-Pflicht für Standardgarantien (≤ 2 Jahre): </w:t>
+      </w:r>
+      <w:r>
+        <w:t>Garantien von bis zu 2 Jahren sind vom Gesetz nicht betroffen und erfordern keine Sonderbehandlung.</w:t>
+      </w:r>
+    </w:p>
+    <w:p>
+      <w:pPr>
+        <w:pStyle w:val="ListNumber"/>
+        <w:spacing w:after="60"/>
+      </w:pPr>
+      <w:r>
+        <w:rPr>
+          <w:b/>
+        </w:rPr>
+        <w:t xml:space="preserve">Keine Label-Pflicht für Teilgarantien: </w:t>
+      </w:r>
+      <w:r>
+        <w:t>Bietet SBS Garantien an, die nicht das gesamte Produkt abdecken (z. B. 5 Jahre Garantie, aber nur auf den Kompressor eines Kühlschranks), fallen diese nicht unter die EU-Verordnung. Sie werden wie bisher als normale Produktattribute gepflegt.</w:t>
+      </w:r>
+    </w:p>
+    <w:p>
+      <w:pPr>
+        <w:pStyle w:val="ListNumber"/>
         <w:spacing w:after="240"/>
       </w:pPr>
       <w:r>
         <w:rPr>
           <w:b/>
         </w:rPr>
-        <w:t xml:space="preserve">Keine grafischen Arbeiten nötig: </w:t>
+        <w:t xml:space="preserve">Keine direkte gesetzliche Strafe bei Nicht-Lieferung: </w:t>
       </w:r>
       <w:r>
-        <w:t>Der Einkauf bzw. Produktmanagement von SBS muss keine Bilddateien oder Logos entwerfen. Das geforderte Dokument ist lediglich das Text-PDF der Garantievereinbarung.</w:t>
+        <w:t>Verbraucherschutzgesetze (VerbRÄG 2026/FAGG) regeln das Verhältnis zum Endverbraucher. Liefert SBS die Daten nicht an Globus, begeht SBS keinen direkten Gesetzesverstoß. Die Konsequenz ist rein vertrieblicher Natur (Globus darf die Garantie nicht mehr bewerben).</w:t>
       </w:r>
     </w:p>
     <w:p>
@@ -423,7 +539,7 @@
           <w:color w:val="1A365D"/>
           <w:sz w:val="26"/>
         </w:rPr>
-        <w:t>4. Handlungsempfehlung für die Geschäftsführung (Andreas Wiesner)</w:t>
+        <w:t>4. Bewertung der Betroffenheit von SBS Austria</w:t>
       </w:r>
     </w:p>
     <w:p>
@@ -435,10 +551,38 @@
         <w:rPr>
           <w:b/>
         </w:rPr>
-        <w:t xml:space="preserve">Schritt 1: Sortimentsabgleich durch Produktmanagement / Vertrieb: </w:t>
+        <w:t xml:space="preserve">Sortimentsabgleich (Betroffenheits-Prüfung): </w:t>
       </w:r>
       <w:r>
-        <w:t>Prüfen, ob SBS-Eigenmarken oder exklusiv vertriebene Artikel mit einer kostenlosen Herstellergarantie von &gt; 2 Jahren an Globus geliefert werden.</w:t>
+        <w:t>Bietet SBS Austria für Artikel, die an Globus geliefert werden, eine kostenlose Herstellergarantie von mehr als 2 Jahren an, die das gesamte Produkt abdeckt (Vollgarantie)? Falls ja: Wir müssen die Garantiedauer (in Monaten) im m.PIM eintragen und das PDF der Garantiebedingungen (Garantiekarte/AGB) hochladen. Falls nein: Es ist keine Aktion erforderlich. Die Artikel werden im System normal weitergeführt.</w:t>
+      </w:r>
+    </w:p>
+    <w:p>
+      <w:pPr>
+        <w:pStyle w:val="ListNumber"/>
+        <w:spacing w:after="240"/>
+      </w:pPr>
+      <w:r>
+        <w:rPr>
+          <w:b/>
+        </w:rPr>
+        <w:t xml:space="preserve">Dokumenten-Bereitstellung: </w:t>
+      </w:r>
+      <w:r>
+        <w:t>Das in m.PIM geforderte Dokument ist lediglich das Text-PDF unserer Garantiebestimmungen, kein grafisches Label.</w:t>
+      </w:r>
+    </w:p>
+    <w:p>
+      <w:pPr>
+        <w:spacing w:before="240" w:after="120"/>
+      </w:pPr>
+      <w:r>
+        <w:rPr>
+          <w:b/>
+          <w:color w:val="1A365D"/>
+          <w:sz w:val="26"/>
+        </w:rPr>
+        <w:t>5. Handlungsempfehlung für die Geschäftsführung (Andreas Wiesner)</w:t>
       </w:r>
     </w:p>
     <w:p>
@@ -450,10 +594,25 @@
         <w:rPr>
           <w:b/>
         </w:rPr>
-        <w:t xml:space="preserve">Schritt 2: Datenpflege im m.PIM (nur bei Betroffenheit): </w:t>
+        <w:t xml:space="preserve">Schritt 1: Sortimentsabgleich initiieren: </w:t>
       </w:r>
       <w:r>
-        <w:t>Aktivierung der „Globus Fachmärkte“-Extension im m.PIM und Befüllung des Attributs „Herstellergarantie“ (in Monaten) sowie Upload der Garantiebedingungen (PDF) für die betroffenen Artikel vor Ablauf der Frist am 27.07.2026.</w:t>
+        <w:t>Das Produktmanagement prüft das an Globus gelieferte Sortiment auf betroffene Vollgarantien (&gt; 2 Jahre).</w:t>
+      </w:r>
+    </w:p>
+    <w:p>
+      <w:pPr>
+        <w:pStyle w:val="ListNumber"/>
+        <w:spacing w:after="60"/>
+      </w:pPr>
+      <w:r>
+        <w:rPr>
+          <w:b/>
+        </w:rPr>
+        <w:t xml:space="preserve">Schritt 2: Gezielte m.PIM-Datenpflege: </w:t>
+      </w:r>
+      <w:r>
+        <w:t>Nur für tatsächlich betroffene Artikel die m.PIM-Erweiterung aktivieren, Monate eintragen und Garantiebedingungen-PDF hochladen.</w:t>
       </w:r>
     </w:p>
     <w:p>
@@ -465,10 +624,10 @@
         <w:rPr>
           <w:b/>
         </w:rPr>
-        <w:t xml:space="preserve">Schritt 3: Rückmeldung bei Nicht-Betroffenheit: </w:t>
+        <w:t xml:space="preserve">Schritt 3: Rückmeldung an Globus bei Nicht-Betroffenheit: </w:t>
       </w:r>
       <w:r>
-        <w:t>Ergibt die Prüfung, dass SBS für Globus-Artikel keine Garantien über 2 Jahre gewährt, sollte dem Globus-Einkauf kurz schriftlich bestätigt werden, dass unsere Artikel nicht unter die Richtlinie fallen.</w:t>
+        <w:t>Sollte SBS für Globus-Artikel keine betroffenen Garantien gewähren, ist laut E-Mail keine weitere Aktion notwendig. Zur Sicherheit sollte dem Globus-Einkauf kurz schriftlich bestätigt werden, dass unsere Artikel nicht unter die Richtlinie fallen.</w:t>
       </w:r>
     </w:p>
     <w:sectPr>

</xml_diff>

<commit_message>
doc: correct label preparation responsibilities under EU 2025/1960
</commit_message>
<xml_diff>
--- a/06_Markant_Mail_Audit_Andreas_Wiesner.docx
+++ b/06_Markant_Mail_Audit_Andreas_Wiesner.docx
@@ -177,7 +177,7 @@
           <w:i w:val="0"/>
           <w:sz w:val="22"/>
         </w:rPr>
-        <w:t xml:space="preserve"> Globus verlangt von uns (SBS) Garantiedaten, um seine gesetzlichen Verbraucherinformationspflichten erfüllen zu können. Die E-Mail von Markant enthält jedoch fachliche Ungenauigkeiten und verwechselt technische Anforderungen des Markant-Systems mit tatsächlichen gesetzlichen Verpflichtungen für uns als Lieferant.</w:t>
+        <w:t xml:space="preserve"> Globus verlangt von uns (SBS) Garantiedaten und das ausgefüllte Label, um seine gesetzlichen Verbraucherinformationspflichten im Webshop und stationären Handel erfüllen zu können. Die E-Mail von Markant ist rechtlich korrekt bezüglich der Pflichtenverteilung: Wenn wir eine Haltbarkeitsgarantie (&gt; 2 Jahre) anbieten, müssen wir das ausgefüllte EU-Garantielabel zur Verfügung stellen.</w:t>
       </w:r>
     </w:p>
     <w:p>
@@ -190,7 +190,7 @@
           <w:color w:val="1A365D"/>
           <w:sz w:val="26"/>
         </w:rPr>
-        <w:t>2. Die drei wesentlichen Diskrepanzen im Markant-Text</w:t>
+        <w:t>2. Analyse der Markant-Aufforderung (Gesetz vs. System)</w:t>
       </w:r>
     </w:p>
     <w:p>
@@ -204,7 +204,7 @@
           <w:i w:val="0"/>
           <w:sz w:val="23"/>
         </w:rPr>
-        <w:t>Diskrepanz 1: Die angebliche Pflicht zum Upload eines „Garantie-Labels als PDF“</w:t>
+        <w:t>Punkt 1: Die Pflicht zur Bereitstellung des ausgefüllten Labels (EU-Vorgabe)</w:t>
       </w:r>
     </w:p>
     <w:p>
@@ -216,10 +216,10 @@
         <w:rPr>
           <w:b/>
         </w:rPr>
-        <w:t xml:space="preserve">Aussage Markant: </w:t>
+        <w:t xml:space="preserve">Die Aufforderung von Markant: </w:t>
       </w:r>
       <w:r>
-        <w:t>Lieferanten (SBS) müssen ein „Garantie-Label als PDF“ über m.PIM hochladen, damit das Globus-System die gewerbliche Haltbarkeitsgarantie erkennt.</w:t>
+        <w:t>Lieferanten (SBS) müssen das entsprechende „Garantie-Label als PDF“ über m.PIM hochladen.</w:t>
       </w:r>
     </w:p>
     <w:p>
@@ -231,10 +231,10 @@
         <w:rPr>
           <w:b/>
         </w:rPr>
-        <w:t xml:space="preserve">Rechtlicher Fakt: </w:t>
+        <w:t xml:space="preserve">Der rechtliche Fakt: </w:t>
       </w:r>
       <w:r>
-        <w:t>Es gibt keine gesetzliche Verpflichtung für uns als Lieferant, ein visuelles Label als PDF zu erstellen oder hochzuladen. Das grüne „GARAN“-Symbol ist ein standardisiertes Element der EU-Kommission. Es wird von den Shop-Systemen der Händler (wie Globus) dynamisch gerendert.</w:t>
+        <w:t>Dies ist korrekt. Gemäß der Durchführungsverordnung (EU) 2025/1960 ist der Hersteller dafür verantwortlich, das harmonisierte Etikett (das grüne „GARAN“-Symbol) mit seinen produktspezifischen Daten auszufüllen und dem Händler zur Verfügung zu stellen. Das Label enthält drei editierbare Platzhalter, die vom Hersteller befüllt werden müssen: 1. Die Garantiedauer (in Jahren), 2. Der Name/Marke des Herstellers, 3. Die Modellkennung des Produkts.</w:t>
       </w:r>
     </w:p>
     <w:p>
@@ -249,7 +249,7 @@
         <w:t xml:space="preserve">Bedeutung für SBS: </w:t>
       </w:r>
       <w:r>
-        <w:t>Markant nutzt hier eine technische Krücke: Das Hochladen eines PDF-Dokuments (tatsächlich gemeint sind die Garantiebedingungen) dient im PIM-System lediglich als Auslöser (Trigger), um die Garantieart systemseitig zu filtern. SBS muss daher kein grafisches Label entwerfen, sondern lediglich die Garantiebedingungen (Text/PDF) hochladen.</w:t>
+        <w:t>Da Globus die fertigen Labels anfordert, muss SBS für betroffene Produkte die offiziellen PDF-Vorlagen der EU-Kommission herunterladen, diese drei Felder ausfüllen und als PDF im m.PIM hinterlegen.</w:t>
       </w:r>
     </w:p>
     <w:p>
@@ -263,7 +263,7 @@
           <w:i w:val="0"/>
           <w:sz w:val="23"/>
         </w:rPr>
-        <w:t>Diskrepanz 2: Die unvollständige Händlerpflicht (Verschweigen der Haftungsbefreiung)</w:t>
+        <w:t>Punkt 2: Die unvollständige Händlerpflicht (Verschweigen der Haftungsbefreiung)</w:t>
       </w:r>
     </w:p>
     <w:p>
@@ -275,7 +275,7 @@
         <w:rPr>
           <w:b/>
         </w:rPr>
-        <w:t xml:space="preserve">Aussage Markant: </w:t>
+        <w:t xml:space="preserve">Die Aufforderung von Markant: </w:t>
       </w:r>
       <w:r>
         <w:t>„Für die gewerbliche Haltbarkeitsgarantie ist der Händler [Globus] darüber hinaus verpflichtet, diese Informationen [...] unter Verwendung des harmonisierten EU-Garantielabels darzustellen.“</w:t>
@@ -290,7 +290,7 @@
         <w:rPr>
           <w:b/>
         </w:rPr>
-        <w:t xml:space="preserve">Rechtlicher Fakt: </w:t>
+        <w:t xml:space="preserve">Der rechtliche Fakt: </w:t>
       </w:r>
       <w:r>
         <w:t>Die Anzeigepflicht des Händlers ist laut EU-Richtlinie 2024/825 (EmpCo) und FAGG konditional (bedingt). Sie gilt nur dann, wenn der Hersteller dem Händler diese Informationen zur Verfügung stellt.</w:t>
@@ -308,7 +308,7 @@
         <w:t xml:space="preserve">Bedeutung für SBS: </w:t>
       </w:r>
       <w:r>
-        <w:t>Globus/Markant stellen die Pflicht des Händlers als absolut dar, um Druck auf uns als Lieferanten auszuüben. Weigert sich ein Lieferant, Daten bereitzustellen, ist der Händler zwar von der Label-Anzeige befreit, darf aber auch nicht mehr mit der Garantie werben (Werbeverbot).</w:t>
+        <w:t>Globus stellt die Pflicht als absolut dar, um Lieferanten zur Zuarbeit zu bewegen. Wenn wir als Lieferant keine Daten/Labels liefern, ist Globus von der Label-Pflicht befreit. Globus darf dann aber auch nicht mehr im Shop oder auf Flyern mit unserer Herstellergarantie werben (Werbeverbot).</w:t>
       </w:r>
     </w:p>
     <w:p>
@@ -322,7 +322,7 @@
           <w:i w:val="0"/>
           <w:sz w:val="23"/>
         </w:rPr>
-        <w:t>Diskrepanz 3: Das Abmahnrisiko durch die automatisierte Globus-Systemlogik</w:t>
+        <w:t>Punkt 3: Das Abmahnrisiko durch automatisierte Systemfilterung</w:t>
       </w:r>
     </w:p>
     <w:p>
@@ -334,7 +334,7 @@
         <w:rPr>
           <w:b/>
         </w:rPr>
-        <w:t xml:space="preserve">Aussage Markant: </w:t>
+        <w:t xml:space="preserve">Die Aufforderung von Markant: </w:t>
       </w:r>
       <w:r>
         <w:t>„Die Unterscheidung der Garantiearten erfolgt dabei systemseitig bei Globus anhand des Vorhandenseins des Garantie-Labels [PDF].“</w:t>
@@ -349,10 +349,10 @@
         <w:rPr>
           <w:b/>
         </w:rPr>
-        <w:t xml:space="preserve">Rechtlicher Fakt: </w:t>
+        <w:t xml:space="preserve">Der rechtliche Fakt: </w:t>
       </w:r>
       <w:r>
-        <w:t>Das offizielle EU-Garantielabel darf ausschließlich für kostenlose Garantien verwendet werden, die das gesamte Gerät abdecken (gewerbliche Haltbarkeitsgarantie). Eine irrtümliche Einblendung des Labels bei Teilgarantien (z. B. nur auf den Motor) ist ein Wettbewerbsverstoß.</w:t>
+        <w:t>Das grüne EU-Garantielabel darf ausschließlich für kostenlose Garantien verwendet werden, die das gesamte Gerät abdecken (gewerbliche Haltbarkeitsgarantie). Eine irrtümliche Einblendung des Labels bei Teilgarantien (z. B. nur auf den Motor) ist ein schwerer Wettbewerbsverstoß.</w:t>
       </w:r>
     </w:p>
     <w:p>
@@ -367,7 +367,7 @@
         <w:t xml:space="preserve">Bedeutung für SBS: </w:t>
       </w:r>
       <w:r>
-        <w:t>Wenn SBS eine Teilgarantie anbietet und dafür fälschlicherweise ein PDF im m.PIM hochlädt, würde Globus dies automatisch als Vollgarantie labeln. Dies führt zu einer direkten Abmahnbarkeit des Händlers (Globus). Eine rein dateibasierte Erkennung durch das PIM-System ist fachlich und rechtlich riskant.</w:t>
+        <w:t>Wenn SBS fälschlicherweise ein PDF-Label für eine Teilgarantie im m.PIM hochlädt, würde Globus dies unkontrolliert einblenden. Das führt zu einer direkten Abmahnbarkeit des Händlers (Globus). Wir müssen daher bei der Zuweisung absolut fehlerfrei arbeiten.</w:t>
       </w:r>
     </w:p>
     <w:p>
@@ -407,7 +407,7 @@
           <w:i w:val="0"/>
           <w:sz w:val="23"/>
         </w:rPr>
-        <w:t>A. Wozu SBS tatsächlich verpflichtet ist (Tatsächliche Pflichten)</w:t>
+        <w:t>A. Wozu SBS tatsächlich verpflichtet ist (Unsere Pflichten)</w:t>
       </w:r>
     </w:p>
     <w:p>
@@ -419,10 +419,10 @@
         <w:rPr>
           <w:b/>
         </w:rPr>
-        <w:t xml:space="preserve">Bereitstellung von Garantiedaten bei aktiver Werbung (Kommerzieller Zwang): </w:t>
+        <w:t xml:space="preserve">Ausfüllen und Bereitstellen des Labels (bei Werbewunsch): </w:t>
       </w:r>
       <w:r>
-        <w:t>Wenn SBS möchte, dass Globus unsere Artikel mit einer Herstellergarantie von über 2 Jahren bewirbt, müssen wir die Daten (Dauer und Link zu den Bedingungen) liefern. Ohne diese Daten darf Globus die Garantie im Shop nicht mehr erwähnen.</w:t>
+        <w:t>Wenn wir wollen, dass Globus unsere Artikel mit einer Garantie von über 2 Jahren bewirbt, müssen wir das harmonisierte EU-Garantielabel als ausgefülltes PDF (mit Herstellername, Modellkennung und Garantiejahren) zur Verfügung stellen.</w:t>
       </w:r>
     </w:p>
     <w:p>
@@ -434,10 +434,25 @@
         <w:rPr>
           <w:b/>
         </w:rPr>
-        <w:t xml:space="preserve">Datenpflege im PIM-System (Schnittstellen-Vertrag): </w:t>
+        <w:t xml:space="preserve">Datenpflege im m.PIM: </w:t>
       </w:r>
       <w:r>
-        <w:t>Um im m.PIM/GDSN-System von Globus gelistet zu bleiben, müssen wir die entsprechenden Datenfelder (Garantiedauer in Monaten) befüllen.</w:t>
+        <w:t>Eintragen der Garantiedauer in Monaten im m.PIM-System.</w:t>
+      </w:r>
+    </w:p>
+    <w:p>
+      <w:pPr>
+        <w:pStyle w:val="ListNumber"/>
+        <w:spacing w:after="60"/>
+      </w:pPr>
+      <w:r>
+        <w:rPr>
+          <w:b/>
+        </w:rPr>
+        <w:t xml:space="preserve">Garantiebedingungen (Dokument): </w:t>
+      </w:r>
+      <w:r>
+        <w:t>Bereitstellung der vollständigen, schriftlichen Garantiebedingungen (Garantie-AGB) für den Verbraucher.</w:t>
       </w:r>
     </w:p>
     <w:p>
@@ -449,10 +464,10 @@
         <w:rPr>
           <w:b/>
         </w:rPr>
-        <w:t xml:space="preserve">Haftung für die Richtigkeit der Angaben: </w:t>
+        <w:t xml:space="preserve">Haftung für korrekte Zuweisung: </w:t>
       </w:r>
       <w:r>
-        <w:t>SBS haftet gegenüber Globus für die Richtigkeit der übermittelten Daten. Bestätigen wir fälschlicherweise eine Garantie als „kostenlose Vollgarantie“ (obwohl es sich um eine Teilgarantie handelt) und wird Globus deswegen abgemahnt, drohen SBS Regressforderungen.</w:t>
+        <w:t>Wir müssen garantieren, dass wir das Label nur für echte, kostenlose Vollgarantien verwenden, um Regressforderungen durch Globus bei Abmahnungen zu verhindern.</w:t>
       </w:r>
     </w:p>
     <w:p>
@@ -478,10 +493,10 @@
         <w:rPr>
           <w:b/>
         </w:rPr>
-        <w:t xml:space="preserve">Kein Erstellen oder Liefern von Grafik-Labels (Bilddateien): </w:t>
+        <w:t xml:space="preserve">Keine gestalterische Eigenkreation: </w:t>
       </w:r>
       <w:r>
-        <w:t>SBS muss keine Bilddateien, PNGs oder fertig gestalteten grünen Symbole („3 GARAN“ etc.) an Globus liefern. Das Rendern des Labels ist die alleinige technische Aufgabe des Online-Shops von Globus.</w:t>
+        <w:t>Wir dürfen das Layout, die Farben, die Schriftarten oder den QR-Code des Labels nicht verändern. Wir müssen die offizielle PDF-Vorlage der EU verwenden.</w:t>
       </w:r>
     </w:p>
     <w:p>
@@ -493,10 +508,10 @@
         <w:rPr>
           <w:b/>
         </w:rPr>
-        <w:t xml:space="preserve">Keine Label-Pflicht für Standardgarantien (≤ 2 Jahre): </w:t>
+        <w:t xml:space="preserve">Keine Pflicht bei Standardgarantien (≤ 2 Jahre): </w:t>
       </w:r>
       <w:r>
-        <w:t>Garantien von bis zu 2 Jahren sind vom Gesetz nicht betroffen und erfordern keine Sonderbehandlung.</w:t>
+        <w:t>Gewöhnliche gesetzliche Gewährleistungsfristen oder Herstellergarantien von bis zu 2 Jahren benötigen kein Garantielabel.</w:t>
       </w:r>
     </w:p>
     <w:p>
@@ -511,7 +526,7 @@
         <w:t xml:space="preserve">Keine Label-Pflicht für Teilgarantien: </w:t>
       </w:r>
       <w:r>
-        <w:t>Bietet SBS Garantien an, die nicht das gesamte Produkt abdecken (z. B. 5 Jahre Garantie, aber nur auf den Kompressor eines Kühlschranks), fallen diese nicht unter die EU-Verordnung. Sie werden wie bisher als normale Produktattribute gepflegt.</w:t>
+        <w:t>Eingeschränkte Garantien (z. B. Garantie nur auf den Motor oder Akku) fallen nicht unter die Verordnung und dürfen kein grünes Label erhalten.</w:t>
       </w:r>
     </w:p>
     <w:p>
@@ -526,7 +541,7 @@
         <w:t xml:space="preserve">Keine direkte gesetzliche Strafe bei Nicht-Lieferung: </w:t>
       </w:r>
       <w:r>
-        <w:t>Verbraucherschutzgesetze (VerbRÄG 2026/FAGG) regeln das Verhältnis zum Endverbraucher. Liefert SBS die Daten nicht an Globus, begeht SBS keinen direkten Gesetzesverstoß. Die Konsequenz ist rein vertrieblicher Natur (Globus darf die Garantie nicht mehr bewerben).</w:t>
+        <w:t>Liefert SBS das Label nicht, droht uns keine behördliche Strafe. Globus darf die Garantie dann jedoch nicht mehr bewerben, was zu einem Wettbewerbsnachteil und Umsatzverlust für unsere Produkte führt.</w:t>
       </w:r>
     </w:p>
     <w:p>
@@ -539,37 +554,50 @@
           <w:color w:val="1A365D"/>
           <w:sz w:val="26"/>
         </w:rPr>
-        <w:t>4. Bewertung der Betroffenheit von SBS Austria</w:t>
+        <w:t>4. Unterschied zum Projekt „Elektropepi“</w:t>
       </w:r>
     </w:p>
     <w:p>
       <w:pPr>
-        <w:pStyle w:val="ListNumber"/>
+        <w:spacing w:after="120" w:before="0"/>
+      </w:pPr>
+      <w:r>
+        <w:rPr>
+          <w:rFonts w:ascii="Calibri" w:hAnsi="Calibri"/>
+          <w:i w:val="0"/>
+          <w:sz w:val="22"/>
+        </w:rPr>
+        <w:t>Da SBS für den Kunden Elektropepi den Online-Shop betreut, ist es wichtig, die beiden Ansätze abzugrenzen:</w:t>
+      </w:r>
+    </w:p>
+    <w:p>
+      <w:pPr>
+        <w:pStyle w:val="ListBullet"/>
         <w:spacing w:after="60"/>
       </w:pPr>
       <w:r>
         <w:rPr>
           <w:b/>
         </w:rPr>
-        <w:t xml:space="preserve">Sortimentsabgleich (Betroffenheits-Prüfung): </w:t>
+        <w:t xml:space="preserve">Bei Globus (SBS ist Lieferant): </w:t>
       </w:r>
       <w:r>
-        <w:t>Bietet SBS Austria für Artikel, die an Globus geliefert werden, eine kostenlose Herstellergarantie von mehr als 2 Jahren an, die das gesamte Produkt abdeckt (Vollgarantie)? Falls ja: Wir müssen die Garantiedauer (in Monaten) im m.PIM eintragen und das PDF der Garantiebedingungen (Garantiekarte/AGB) hochladen. Falls nein: Es ist keine Aktion erforderlich. Die Artikel werden im System normal weitergeführt.</w:t>
+        <w:t>Globus verlangt das ausgefüllte PDF-Label von uns. Wir müssen die PDFs manuell ausfüllen und hochladen.</w:t>
       </w:r>
     </w:p>
     <w:p>
       <w:pPr>
-        <w:pStyle w:val="ListNumber"/>
+        <w:pStyle w:val="ListBullet"/>
         <w:spacing w:after="240"/>
       </w:pPr>
       <w:r>
         <w:rPr>
           <w:b/>
         </w:rPr>
-        <w:t xml:space="preserve">Dokumenten-Bereitstellung: </w:t>
+        <w:t xml:space="preserve">Bei Elektropepi (SBS ist Shop-Entwickler): </w:t>
       </w:r>
       <w:r>
-        <w:t>Das in m.PIM geforderte Dokument ist lediglich das Text-PDF unserer Garantiebestimmungen, kein grafisches Label.</w:t>
+        <w:t>Um unseren Lieferanten den Aufwand von tausenden PDF-Uploads zu ersparen, haben wir uns für eine technische Optimierung entschieden: Unser Magento-Shop-Modul liest die Rohdaten (Jahre, Link) aus der Datenbank aus und generiert das grüne EU-Label vollautomatisch im Frontend. Dies ist technisch deutlich moderner und wartungsärmer als das dateibasierte Verfahren von Globus.</w:t>
       </w:r>
     </w:p>
     <w:p>
@@ -597,7 +625,7 @@
         <w:t xml:space="preserve">Schritt 1: Sortimentsabgleich initiieren: </w:t>
       </w:r>
       <w:r>
-        <w:t>Das Produktmanagement prüft das an Globus gelieferte Sortiment auf betroffene Vollgarantien (&gt; 2 Jahre).</w:t>
+        <w:t>Prüfen, welche SBS-Eigenmarken oder exklusiv vertriebenen Artikel mit einer kostenlosen Herstellergarantie von &gt; 2 Jahren an Globus geliefert werden.</w:t>
       </w:r>
     </w:p>
     <w:p>
@@ -609,10 +637,10 @@
         <w:rPr>
           <w:b/>
         </w:rPr>
-        <w:t xml:space="preserve">Schritt 2: Gezielte m.PIM-Datenpflege: </w:t>
+        <w:t xml:space="preserve">Schritt 2: Label-Erstellung &amp; Upload (nur bei Betroffenheit): </w:t>
       </w:r>
       <w:r>
-        <w:t>Nur für tatsächlich betroffene Artikel die m.PIM-Erweiterung aktivieren, Monate eintragen und Garantiebedingungen-PDF hochladen.</w:t>
+        <w:t>Die offizielle editierbare PDF-Vorlage der EU-Kommission herunterladen, für die betroffenen Artikel mit Hersteller, Modellkennung und Jahren ausfüllen und im m.PIM hochladen.</w:t>
       </w:r>
     </w:p>
     <w:p>
@@ -624,7 +652,7 @@
         <w:rPr>
           <w:b/>
         </w:rPr>
-        <w:t xml:space="preserve">Schritt 3: Rückmeldung an Globus bei Nicht-Betroffenheit: </w:t>
+        <w:t xml:space="preserve">Schritt 3: Rückmeldung bei Nicht-Betroffenheit: </w:t>
       </w:r>
       <w:r>
         <w:t>Sollte SBS für Globus-Artikel keine betroffenen Garantien gewähren, ist laut E-Mail keine weitere Aktion notwendig. Zur Sicherheit sollte dem Globus-Einkauf kurz schriftlich bestätigt werden, dass unsere Artikel nicht unter die Richtlinie fallen.</w:t>

</xml_diff>

<commit_message>
doc: finalize Markant audit based on WKO text about label prepare duties
</commit_message>
<xml_diff>
--- a/06_Markant_Mail_Audit_Andreas_Wiesner.docx
+++ b/06_Markant_Mail_Audit_Andreas_Wiesner.docx
@@ -135,7 +135,7 @@
           <w:i w:val="0"/>
           <w:sz w:val="22"/>
         </w:rPr>
-        <w:t>Richtigstellung der Rollen:</w:t>
+        <w:t>Klarstellung der Rollen:</w:t>
       </w:r>
       <w:r>
         <w:rPr>
@@ -177,7 +177,41 @@
           <w:i w:val="0"/>
           <w:sz w:val="22"/>
         </w:rPr>
-        <w:t xml:space="preserve"> Globus verlangt von uns (SBS) Garantiedaten und das ausgefüllte Label, um seine gesetzlichen Verbraucherinformationspflichten im Webshop und stationären Handel erfüllen zu können. Die E-Mail von Markant ist rechtlich korrekt bezüglich der Pflichtenverteilung: Wenn wir eine Haltbarkeitsgarantie (&gt; 2 Jahre) anbieten, müssen wir das ausgefüllte EU-Garantielabel zur Verfügung stellen.</w:t>
+        <w:t xml:space="preserve"> Globus verlangt von uns (SBS) Garantiedaten und das Hochladen eines ausgefüllten PDF-Garantielabels. </w:t>
+      </w:r>
+      <w:r>
+        <w:rPr>
+          <w:rFonts w:ascii="Calibri" w:hAnsi="Calibri"/>
+          <w:b/>
+          <w:i w:val="0"/>
+          <w:sz w:val="22"/>
+        </w:rPr>
+        <w:t>Wichtigste rechtliche Erkenntnis:</w:t>
+      </w:r>
+      <w:r>
+        <w:rPr>
+          <w:rFonts w:ascii="Calibri" w:hAnsi="Calibri"/>
+          <w:i w:val="0"/>
+          <w:sz w:val="22"/>
+        </w:rPr>
+        <w:t xml:space="preserve"> Der E-Mail-Text von Markant vermischt eine rein systembedingte Vorgabe von Globus mit der tatsächlichen Gesetzeslage. Laut EU-Verordnung und WKO-Leitfaden ist der Hersteller gesetzlich nur verpflichtet, dem Händler die Informationen (Rohdaten) bereitzustellen. Es gibt </w:t>
+      </w:r>
+      <w:r>
+        <w:rPr>
+          <w:rFonts w:ascii="Calibri" w:hAnsi="Calibri"/>
+          <w:b/>
+          <w:i w:val="0"/>
+          <w:sz w:val="22"/>
+        </w:rPr>
+        <w:t>keine gesetzliche Pflicht</w:t>
+      </w:r>
+      <w:r>
+        <w:rPr>
+          <w:rFonts w:ascii="Calibri" w:hAnsi="Calibri"/>
+          <w:i w:val="0"/>
+          <w:sz w:val="22"/>
+        </w:rPr>
+        <w:t xml:space="preserve"> für uns als Hersteller, ein digitales Grafik- oder PDF-Label für den Online-Shop des Händlers zu erstellen. Die Pflicht zur Darstellung des Labels im Online-Shop liegt beim Händler (Globus).</w:t>
       </w:r>
     </w:p>
     <w:p>
@@ -190,7 +224,7 @@
           <w:color w:val="1A365D"/>
           <w:sz w:val="26"/>
         </w:rPr>
-        <w:t>2. Analyse der Markant-Aufforderung (Gesetz vs. System)</w:t>
+        <w:t>2. Die drei wesentlichen Diskrepanzen im Markant-Text</w:t>
       </w:r>
     </w:p>
     <w:p>
@@ -204,7 +238,7 @@
           <w:i w:val="0"/>
           <w:sz w:val="23"/>
         </w:rPr>
-        <w:t>Punkt 1: Die Pflicht zur Bereitstellung des ausgefüllten Labels (EU-Vorgabe)</w:t>
+        <w:t>Diskrepanz 1: Die angebliche gesetzliche Pflicht zum PDF-Label-Upload</w:t>
       </w:r>
     </w:p>
     <w:p>
@@ -216,10 +250,10 @@
         <w:rPr>
           <w:b/>
         </w:rPr>
-        <w:t xml:space="preserve">Die Aufforderung von Markant: </w:t>
+        <w:t xml:space="preserve">Aussage Markant: </w:t>
       </w:r>
       <w:r>
-        <w:t>Lieferanten (SBS) müssen das entsprechende „Garantie-Label als PDF“ über m.PIM hochladen.</w:t>
+        <w:t>Lieferanten (SBS) müssen ein „Garantie-Label als PDF“ über m.PIM hochladen, damit das Globus-System die gewerbliche Haltbarkeitsgarantie im Shop anzeigt.</w:t>
       </w:r>
     </w:p>
     <w:p>
@@ -231,25 +265,10 @@
         <w:rPr>
           <w:b/>
         </w:rPr>
-        <w:t xml:space="preserve">Der rechtliche Fakt: </w:t>
+        <w:t xml:space="preserve">Rechtlicher Fakt (laut WKO-Leitfaden): </w:t>
       </w:r>
       <w:r>
-        <w:t>Dies ist korrekt. Gemäß der Durchführungsverordnung (EU) 2025/1960 ist der Hersteller dafür verantwortlich, das harmonisierte Etikett (das grüne „GARAN“-Symbol) mit seinen produktspezifischen Daten auszufüllen und dem Händler zur Verfügung zu stellen. Das Label enthält drei editierbare Platzhalter, die vom Hersteller befüllt werden müssen: 1. Die Garantiedauer (in Jahren), 2. Der Name/Marke des Herstellers, 3. Die Modellkennung des Produkts.</w:t>
-      </w:r>
-    </w:p>
-    <w:p>
-      <w:pPr>
-        <w:pStyle w:val="ListBullet"/>
-        <w:spacing w:after="120"/>
-      </w:pPr>
-      <w:r>
-        <w:rPr>
-          <w:b/>
-        </w:rPr>
-        <w:t xml:space="preserve">Bedeutung für SBS: </w:t>
-      </w:r>
-      <w:r>
-        <w:t>Da Globus die fertigen Labels anfordert, muss SBS für betroffene Produkte die offiziellen PDF-Vorlagen der EU-Kommission herunterladen, diese drei Felder ausfüllen und als PDF im m.PIM hinterlegen.</w:t>
+        <w:t>Die gesetzliche Pflicht des Herstellers besteht darin, dem Händler die Informationen (Garantiedauer, Hersteller/Marke, Modellkennung) zur Verfügung zu stellen. Wie diese Daten im Online-Shop dargestellt werden, liegt in der Verantwortung des Händlers. Was dahintersteckt: Globus nutzt hier eine rein IT-technische Krücke: Anstatt ihr Webshop-System so zu programmieren, dass es das grüne EU-Label dynamisch aus den Produktdaten generiert, wälzen sie den Aufwand auf die Lieferanten ab. Sie verlangen ein fertiges PDF, um dieses einfach im Shop anzuzeigen. Dies ist eine Vertragsvorgabe von Globus, keine gesetzliche Pflicht.</w:t>
       </w:r>
     </w:p>
     <w:p>
@@ -263,7 +282,7 @@
           <w:i w:val="0"/>
           <w:sz w:val="23"/>
         </w:rPr>
-        <w:t>Punkt 2: Die unvollständige Händlerpflicht (Verschweigen der Haftungsbefreiung)</w:t>
+        <w:t>Diskrepanz 2: Die unvollständige Händlerpflicht (Verschweigen der Haftungsbefreiung)</w:t>
       </w:r>
     </w:p>
     <w:p>
@@ -275,7 +294,7 @@
         <w:rPr>
           <w:b/>
         </w:rPr>
-        <w:t xml:space="preserve">Die Aufforderung von Markant: </w:t>
+        <w:t xml:space="preserve">Aussage Markant: </w:t>
       </w:r>
       <w:r>
         <w:t>„Für die gewerbliche Haltbarkeitsgarantie ist der Händler [Globus] darüber hinaus verpflichtet, diese Informationen [...] unter Verwendung des harmonisierten EU-Garantielabels darzustellen.“</w:t>
@@ -290,7 +309,7 @@
         <w:rPr>
           <w:b/>
         </w:rPr>
-        <w:t xml:space="preserve">Der rechtliche Fakt: </w:t>
+        <w:t xml:space="preserve">Rechtlicher Fakt: </w:t>
       </w:r>
       <w:r>
         <w:t>Die Anzeigepflicht des Händlers ist laut EU-Richtlinie 2024/825 (EmpCo) und FAGG konditional (bedingt). Sie gilt nur dann, wenn der Hersteller dem Händler diese Informationen zur Verfügung stellt.</w:t>
@@ -308,7 +327,7 @@
         <w:t xml:space="preserve">Bedeutung für SBS: </w:t>
       </w:r>
       <w:r>
-        <w:t>Globus stellt die Pflicht als absolut dar, um Lieferanten zur Zuarbeit zu bewegen. Wenn wir als Lieferant keine Daten/Labels liefern, ist Globus von der Label-Pflicht befreit. Globus darf dann aber auch nicht mehr im Shop oder auf Flyern mit unserer Herstellergarantie werben (Werbeverbot).</w:t>
+        <w:t>Liefert ein Hersteller die Daten nicht, entfällt die Label-Pflicht für Globus (keine Abmahngefahr). Allerdings darf Globus das Produkt dann auch nicht mehr mit einer Garantie bewerben (Werbeverbot). Globus baut im Anschreiben Druck auf, um dieses Werbeverbot zu umgehen.</w:t>
       </w:r>
     </w:p>
     <w:p>
@@ -322,7 +341,7 @@
           <w:i w:val="0"/>
           <w:sz w:val="23"/>
         </w:rPr>
-        <w:t>Punkt 3: Das Abmahnrisiko durch automatisierte Systemfilterung</w:t>
+        <w:t>Diskrepanz 3: Das Abmahnrisiko durch automatisierte Globus-Systemlogik</w:t>
       </w:r>
     </w:p>
     <w:p>
@@ -334,7 +353,7 @@
         <w:rPr>
           <w:b/>
         </w:rPr>
-        <w:t xml:space="preserve">Die Aufforderung von Markant: </w:t>
+        <w:t xml:space="preserve">Aussage Markant: </w:t>
       </w:r>
       <w:r>
         <w:t>„Die Unterscheidung der Garantiearten erfolgt dabei systemseitig bei Globus anhand des Vorhandenseins des Garantie-Labels [PDF].“</w:t>
@@ -349,10 +368,10 @@
         <w:rPr>
           <w:b/>
         </w:rPr>
-        <w:t xml:space="preserve">Der rechtliche Fakt: </w:t>
+        <w:t xml:space="preserve">Rechtlicher Fakt: </w:t>
       </w:r>
       <w:r>
-        <w:t>Das grüne EU-Garantielabel darf ausschließlich für kostenlose Garantien verwendet werden, die das gesamte Gerät abdecken (gewerbliche Haltbarkeitsgarantie). Eine irrtümliche Einblendung des Labels bei Teilgarantien (z. B. nur auf den Motor) ist ein schwerer Wettbewerbsverstoß.</w:t>
+        <w:t>Das grüne EU-Garantielabel darf ausschließlich für kostenlose Garantien verwendet werden, die das gesamte Gerät abdecken (gewerbliche Haltbarkeitsgarantie). Eine irrtümliche Einblendung des Labels bei Teilgarantien (z. B. 5 Jahre Garantie, aber nur auf den Kompressor eines Kühlschranks) ist ein schwerer Wettbewerbsverstoß.</w:t>
       </w:r>
     </w:p>
     <w:p>
@@ -367,7 +386,7 @@
         <w:t xml:space="preserve">Bedeutung für SBS: </w:t>
       </w:r>
       <w:r>
-        <w:t>Wenn SBS fälschlicherweise ein PDF-Label für eine Teilgarantie im m.PIM hochlädt, würde Globus dies unkontrolliert einblenden. Das führt zu einer direkten Abmahnbarkeit des Händlers (Globus). Wir müssen daher bei der Zuweisung absolut fehlerfrei arbeiten.</w:t>
+        <w:t>Wenn SBS fälschlicherweise ein PDF-Label für eine Teilgarantie im m.PIM hochlädt, würde Globus dies automatisch als Vollgarantie anzeigen. Dies führt zu einer direkten Abmahnbarkeit des Händlers (Globus). Eine rein dateibasierte Erkennung durch das PIM-System ist fachlich und rechtlich riskant.</w:t>
       </w:r>
     </w:p>
     <w:p>
@@ -393,7 +412,7 @@
           <w:i w:val="0"/>
           <w:sz w:val="22"/>
         </w:rPr>
-        <w:t>Um für die Geschäftsführung absolute Klarheit zu schaffen, werden unsere Pflichten im Folgenden in „tatsächliche Pflichten“ und „keine Verpflichtungen“ unterteilt:</w:t>
+        <w:t>Für die Geschäftsführung teilen sich unsere Pflichten als Hersteller/Lieferant gegenüber Händlern (wie Globus) wie folgt auf:</w:t>
       </w:r>
     </w:p>
     <w:p>
@@ -407,7 +426,7 @@
           <w:i w:val="0"/>
           <w:sz w:val="23"/>
         </w:rPr>
-        <w:t>A. Wozu SBS tatsächlich verpflichtet ist (Unsere Pflichten)</w:t>
+        <w:t>A. Wozu SBS tatsächlich verpflichtet ist (Tatsächliche Pflichten)</w:t>
       </w:r>
     </w:p>
     <w:p>
@@ -419,10 +438,10 @@
         <w:rPr>
           <w:b/>
         </w:rPr>
-        <w:t xml:space="preserve">Ausfüllen und Bereitstellen des Labels (bei Werbewunsch): </w:t>
+        <w:t xml:space="preserve">Bereitstellung von Garantiedaten bei aktiver Werbung (Kommerzieller Zwang): </w:t>
       </w:r>
       <w:r>
-        <w:t>Wenn wir wollen, dass Globus unsere Artikel mit einer Garantie von über 2 Jahren bewirbt, müssen wir das harmonisierte EU-Garantielabel als ausgefülltes PDF (mit Herstellername, Modellkennung und Garantiejahren) zur Verfügung stellen.</w:t>
+        <w:t>Wenn SBS möchte, dass Globus unsere Artikel mit einer Garantie &gt; 2 Jahren bewirbt, müssen wir die Daten (Dauer und Link zu den Bedingungen) liefern. Ohne diese Daten darf Globus die Garantie im Shop nicht erwähnen.</w:t>
       </w:r>
     </w:p>
     <w:p>
@@ -434,25 +453,10 @@
         <w:rPr>
           <w:b/>
         </w:rPr>
-        <w:t xml:space="preserve">Datenpflege im m.PIM: </w:t>
+        <w:t xml:space="preserve">Datenpflege im m.PIM (Schnittstellen-Vorgabe): </w:t>
       </w:r>
       <w:r>
-        <w:t>Eintragen der Garantiedauer in Monaten im m.PIM-System.</w:t>
-      </w:r>
-    </w:p>
-    <w:p>
-      <w:pPr>
-        <w:pStyle w:val="ListNumber"/>
-        <w:spacing w:after="60"/>
-      </w:pPr>
-      <w:r>
-        <w:rPr>
-          <w:b/>
-        </w:rPr>
-        <w:t xml:space="preserve">Garantiebedingungen (Dokument): </w:t>
-      </w:r>
-      <w:r>
-        <w:t>Bereitstellung der vollständigen, schriftlichen Garantiebedingungen (Garantie-AGB) für den Verbraucher.</w:t>
+        <w:t>Um im m.PIM/GDSN-System von Globus gelistet zu bleiben, müssen wir die entsprechenden Datenfelder (Garantiedauer in Monaten) befüllen.</w:t>
       </w:r>
     </w:p>
     <w:p>
@@ -464,10 +468,10 @@
         <w:rPr>
           <w:b/>
         </w:rPr>
-        <w:t xml:space="preserve">Haftung für korrekte Zuweisung: </w:t>
+        <w:t xml:space="preserve">Vertragliche Bereitstellung des PDF-Labels für Globus: </w:t>
       </w:r>
       <w:r>
-        <w:t>Wir müssen garantieren, dass wir das Label nur für echte, kostenlose Vollgarantien verwenden, um Regressforderungen durch Globus bei Abmahnungen zu verhindern.</w:t>
+        <w:t>Da Globus dies systemseitig verlangt, müssen wir (um die Bewerbung zu sichern) die offizielle PDF-Vorlage der EU herunterladen, mit Herstellername, Modellkennung und Garantiejahren befüllen und im m.PIM hochladen.</w:t>
       </w:r>
     </w:p>
     <w:p>
@@ -481,7 +485,7 @@
           <w:i w:val="0"/>
           <w:sz w:val="23"/>
         </w:rPr>
-        <w:t>B. Wozu SBS NICHT verpflichtet ist (Keine Verpflichtungen)</w:t>
+        <w:t>B. Wozu SBS NICHT verpflichtet ist (Keine gesetzlichen Pflichten)</w:t>
       </w:r>
     </w:p>
     <w:p>
@@ -493,10 +497,10 @@
         <w:rPr>
           <w:b/>
         </w:rPr>
-        <w:t xml:space="preserve">Keine gestalterische Eigenkreation: </w:t>
+        <w:t xml:space="preserve">Keine gesetzliche Grafik-Pflicht für Online-Shops: </w:t>
       </w:r>
       <w:r>
-        <w:t>Wir dürfen das Layout, die Farben, die Schriftarten oder den QR-Code des Labels nicht verändern. Wir müssen die offizielle PDF-Vorlage der EU verwenden.</w:t>
+        <w:t>Das Gesetz verpflichtet den Hersteller nicht, dem Händler fertige Bilddateien oder PDFs des Labels für dessen Webshop zu liefern. Die technische Umsetzung im Online-Shop ist Sache des Händlers.</w:t>
       </w:r>
     </w:p>
     <w:p>
@@ -526,7 +530,7 @@
         <w:t xml:space="preserve">Keine Label-Pflicht für Teilgarantien: </w:t>
       </w:r>
       <w:r>
-        <w:t>Eingeschränkte Garantien (z. B. Garantie nur auf den Motor oder Akku) fallen nicht unter die Verordnung und dürfen kein grünes Label erhalten.</w:t>
+        <w:t>Bietet SBS Garantien an, die nicht das gesamte Produkt abdecken (z. B. Garantie nur auf bestimmte Teile), dürfen diese kein grünes EU-Label erhalten.</w:t>
       </w:r>
     </w:p>
     <w:p>
@@ -541,7 +545,7 @@
         <w:t xml:space="preserve">Keine direkte gesetzliche Strafe bei Nicht-Lieferung: </w:t>
       </w:r>
       <w:r>
-        <w:t>Liefert SBS das Label nicht, droht uns keine behördliche Strafe. Globus darf die Garantie dann jedoch nicht mehr bewerben, was zu einem Wettbewerbsnachteil und Umsatzverlust für unsere Produkte führt.</w:t>
+        <w:t>Liefert SBS die Daten nicht an Globus, begeht SBS keinen Gesetzesverstoß. Die Konsequenz ist rein vertrieblicher Natur (Globus darf die Garantie nicht mehr bewerben, was zu Umsatzverlusten führt).</w:t>
       </w:r>
     </w:p>
     <w:p>
@@ -554,7 +558,7 @@
           <w:color w:val="1A365D"/>
           <w:sz w:val="26"/>
         </w:rPr>
-        <w:t>4. Unterschied zum Projekt „Elektropepi“</w:t>
+        <w:t>4. Relevanz für unser Projekt „Elektropepi“</w:t>
       </w:r>
     </w:p>
     <w:p>
@@ -567,7 +571,7 @@
           <w:i w:val="0"/>
           <w:sz w:val="22"/>
         </w:rPr>
-        <w:t>Da SBS für den Kunden Elektropepi den Online-Shop betreut, ist es wichtig, die beiden Ansätze abzugrenzen:</w:t>
+        <w:t>Die Analyse bestätigt, dass unser Ansatz für das Projekt Elektropepi (wo wir die Rolle des Händlers/Shop-Entwicklers einnehmen) goldrichtig ist:</w:t>
       </w:r>
     </w:p>
     <w:p>
@@ -579,10 +583,25 @@
         <w:rPr>
           <w:b/>
         </w:rPr>
-        <w:t xml:space="preserve">Bei Globus (SBS ist Lieferant): </w:t>
+        <w:t xml:space="preserve">Datenerfassung: </w:t>
       </w:r>
       <w:r>
-        <w:t>Globus verlangt das ausgefüllte PDF-Label von uns. Wir müssen die PDFs manuell ausfüllen und hochladen.</w:t>
+        <w:t>Wir verlangen von Elektropepis Lieferanten nur die Rohdaten per Excel (Marke, Modell, Jahre, Link, Bestätigung).</w:t>
+      </w:r>
+    </w:p>
+    <w:p>
+      <w:pPr>
+        <w:pStyle w:val="ListBullet"/>
+        <w:spacing w:after="60"/>
+      </w:pPr>
+      <w:r>
+        <w:rPr>
+          <w:b/>
+        </w:rPr>
+        <w:t xml:space="preserve">Automatisierte Generierung: </w:t>
+      </w:r>
+      <w:r>
+        <w:t>Unser Magento-Shop-Modul generiert das grüne EU-Label vollautomatisch und dynamisch im Frontend.</w:t>
       </w:r>
     </w:p>
     <w:p>
@@ -594,10 +613,10 @@
         <w:rPr>
           <w:b/>
         </w:rPr>
-        <w:t xml:space="preserve">Bei Elektropepi (SBS ist Shop-Entwickler): </w:t>
+        <w:t xml:space="preserve">Vorteil: </w:t>
       </w:r>
       <w:r>
-        <w:t>Um unseren Lieferanten den Aufwand von tausenden PDF-Uploads zu ersparen, haben wir uns für eine technische Optimierung entschieden: Unser Magento-Shop-Modul liest die Rohdaten (Jahre, Link) aus der Datenbank aus und generiert das grüne EU-Label vollautomatisch im Frontend. Dies ist technisch deutlich moderner und wartungsärmer als das dateibasierte Verfahren von Globus.</w:t>
+        <w:t>Wir ersparen unseren Lieferanten den mühsamen manuellen PDF-Upload und schützen Elektropepi vor Abmahnungen, da wir Teilgarantien über unsere Excel-Validierung (Spalte I) systematisch filtern.</w:t>
       </w:r>
     </w:p>
     <w:p>
@@ -625,7 +644,7 @@
         <w:t xml:space="preserve">Schritt 1: Sortimentsabgleich initiieren: </w:t>
       </w:r>
       <w:r>
-        <w:t>Prüfen, welche SBS-Eigenmarken oder exklusiv vertriebenen Artikel mit einer kostenlosen Herstellergarantie von &gt; 2 Jahren an Globus geliefert werden.</w:t>
+        <w:t>Das Produktmanagement prüft, ob SBS-Eigenmarken oder exklusiv vertriebene Artikel mit einer kostenlosen Herstellergarantie von &gt; 2 Jahren an Globus geliefert werden.</w:t>
       </w:r>
     </w:p>
     <w:p>
@@ -637,10 +656,10 @@
         <w:rPr>
           <w:b/>
         </w:rPr>
-        <w:t xml:space="preserve">Schritt 2: Label-Erstellung &amp; Upload (nur bei Betroffenheit): </w:t>
+        <w:t xml:space="preserve">Schritt 2: PIM-Pflege &amp; PDF-Befüllung (nur bei Betroffenheit): </w:t>
       </w:r>
       <w:r>
-        <w:t>Die offizielle editierbare PDF-Vorlage der EU-Kommission herunterladen, für die betroffenen Artikel mit Hersteller, Modellkennung und Jahren ausfüllen und im m.PIM hochladen.</w:t>
+        <w:t>Nur für betroffene Artikel die m.PIM-Extension aktivieren, die Monate eintragen und das ausgefüllte EU-PDF-Garantielabel (Vorlage der EU-Kommission) hochladen.</w:t>
       </w:r>
     </w:p>
     <w:p>
@@ -655,7 +674,7 @@
         <w:t xml:space="preserve">Schritt 3: Rückmeldung bei Nicht-Betroffenheit: </w:t>
       </w:r>
       <w:r>
-        <w:t>Sollte SBS für Globus-Artikel keine betroffenen Garantien gewähren, ist laut E-Mail keine weitere Aktion notwendig. Zur Sicherheit sollte dem Globus-Einkauf kurz schriftlich bestätigt werden, dass unsere Artikel nicht unter die Richtlinie fallen.</w:t>
+        <w:t>Gewährt SBS für Globus-Artikel keine Garantien über 2 Jahre, sollte dem Globus-Einkauf kurz schriftlich bestätigt werden, dass unsere Artikel nicht unter die Richtlinie fallen.</w:t>
       </w:r>
     </w:p>
     <w:sectPr>

</xml_diff>